<commit_message>
segundo cambio: se agrego un texto hecho por chatgpt
</commit_message>
<xml_diff>
--- a/Jdahsiugdiugiuasbsiugidgiadififiugduysfyvdtyvfguyaghau.docx
+++ b/Jdahsiugdiugiuasbsiugidgiadififiugduysfyvdtyvfguyaghau.docx
@@ -23,12 +23,596 @@
           <w:lang w:val="es-EC"/>
         </w:rPr>
       </w:pPr>
-      <w:r>
-        <w:rPr>
-          <w:lang w:val="es-EC"/>
-        </w:rPr>
-        <w:t>dfhsudhiaugsyuauydchcbewbeyvsa</w:t>
-      </w:r>
+      <w:proofErr w:type="spellStart"/>
+      <w:r>
+        <w:rPr>
+          <w:lang w:val="es-EC"/>
+        </w:rPr>
+        <w:t>D</w:t>
+      </w:r>
+      <w:r>
+        <w:rPr>
+          <w:lang w:val="es-EC"/>
+        </w:rPr>
+        <w:t>fhsudhiaugsyuauydchcbewbeyvsa</w:t>
+      </w:r>
+      <w:proofErr w:type="spellEnd"/>
+    </w:p>
+    <w:p>
+      <w:pPr>
+        <w:rPr>
+          <w:lang w:val="es-EC"/>
+        </w:rPr>
+      </w:pPr>
+      <w:r>
+        <w:rPr>
+          <w:lang w:val="es-EC"/>
+        </w:rPr>
+        <w:t>}</w:t>
+      </w:r>
+    </w:p>
+    <w:p>
+      <w:pPr>
+        <w:rPr>
+          <w:lang w:val="es-EC"/>
+        </w:rPr>
+      </w:pPr>
+      <w:r>
+        <w:rPr>
+          <w:lang w:val="es-EC"/>
+        </w:rPr>
+        <w:t>UHADBADJKND</w:t>
+      </w:r>
+    </w:p>
+    <w:p>
+      <w:pPr>
+        <w:rPr>
+          <w:lang w:val="es-EC"/>
+        </w:rPr>
+      </w:pPr>
+    </w:p>
+    <w:p>
+      <w:pPr>
+        <w:rPr>
+          <w:lang w:val="es-EC"/>
+        </w:rPr>
+      </w:pPr>
+      <w:r>
+        <w:rPr>
+          <w:lang w:val="es-EC"/>
+        </w:rPr>
+        <w:t>SANUIDGIADBKJDA</w:t>
+      </w:r>
+    </w:p>
+    <w:p>
+      <w:pPr>
+        <w:rPr>
+          <w:lang w:val="es-EC"/>
+        </w:rPr>
+      </w:pPr>
+      <w:r>
+        <w:rPr>
+          <w:lang w:val="es-EC"/>
+        </w:rPr>
+        <w:t>ASJUDIADNLMDKLNUFBAD</w:t>
+      </w:r>
+    </w:p>
+    <w:p>
+      <w:pPr>
+        <w:rPr>
+          <w:lang w:val="es-EC"/>
+        </w:rPr>
+      </w:pPr>
+      <w:r>
+        <w:rPr>
+          <w:lang w:val="es-EC"/>
+        </w:rPr>
+        <w:t>ADHIABFANJKFKJADA</w:t>
+      </w:r>
+    </w:p>
+    <w:p>
+      <w:pPr>
+        <w:rPr>
+          <w:lang w:val="es-EC"/>
+        </w:rPr>
+      </w:pPr>
+      <w:proofErr w:type="gramStart"/>
+      <w:r>
+        <w:rPr>
+          <w:lang w:val="es-EC"/>
+        </w:rPr>
+        <w:t>Exacto, estás justo en la pantalla correcta!</w:t>
+      </w:r>
+      <w:proofErr w:type="gramEnd"/>
+      <w:r>
+        <w:rPr>
+          <w:lang w:val="es-EC"/>
+        </w:rPr>
+        <w:t xml:space="preserve"> Ese es el menú de los tokens clásicos.</w:t>
+      </w:r>
+    </w:p>
+    <w:p>
+      <w:pPr>
+        <w:rPr>
+          <w:lang w:val="es-EC"/>
+        </w:rPr>
+      </w:pPr>
+      <w:r>
+        <w:rPr>
+          <w:lang w:val="es-EC"/>
+        </w:rPr>
+        <w:t>Para terminar de configurarlo, haz lo siguiente:</w:t>
+      </w:r>
+    </w:p>
+    <w:p>
+      <w:pPr>
+        <w:numPr>
+          <w:ilvl w:val="0"/>
+          <w:numId w:val="1"/>
+        </w:numPr>
+        <w:rPr>
+          <w:lang w:val="es-EC"/>
+        </w:rPr>
+      </w:pPr>
+      <w:r>
+        <w:rPr>
+          <w:b/>
+          <w:bCs/>
+          <w:lang w:val="es-EC"/>
+        </w:rPr>
+        <w:t>Marca la casilla principal que dice repo</w:t>
+      </w:r>
+      <w:r>
+        <w:rPr>
+          <w:lang w:val="es-EC"/>
+        </w:rPr>
+        <w:t xml:space="preserve"> (la primerita de arriba a la izquierda). Al seleccionarla, verás que automáticamente se marcan todas las de abajo (</w:t>
+      </w:r>
+      <w:proofErr w:type="spellStart"/>
+      <w:proofErr w:type="gramStart"/>
+      <w:r>
+        <w:rPr>
+          <w:lang w:val="es-EC"/>
+        </w:rPr>
+        <w:t>repo:status</w:t>
+      </w:r>
+      <w:proofErr w:type="spellEnd"/>
+      <w:proofErr w:type="gramEnd"/>
+      <w:r>
+        <w:rPr>
+          <w:lang w:val="es-EC"/>
+        </w:rPr>
+        <w:t xml:space="preserve">, </w:t>
+      </w:r>
+      <w:proofErr w:type="spellStart"/>
+      <w:r>
+        <w:rPr>
+          <w:lang w:val="es-EC"/>
+        </w:rPr>
+        <w:t>repo_deployment</w:t>
+      </w:r>
+      <w:proofErr w:type="spellEnd"/>
+      <w:r>
+        <w:rPr>
+          <w:lang w:val="es-EC"/>
+        </w:rPr>
+        <w:t>, etc.).</w:t>
+      </w:r>
+    </w:p>
+    <w:p>
+      <w:pPr>
+        <w:numPr>
+          <w:ilvl w:val="0"/>
+          <w:numId w:val="1"/>
+        </w:numPr>
+        <w:rPr>
+          <w:lang w:val="es-EC"/>
+        </w:rPr>
+      </w:pPr>
+      <w:r>
+        <w:rPr>
+          <w:lang w:val="es-EC"/>
+        </w:rPr>
+        <w:t xml:space="preserve">Desplázate hasta el final de toda esa página web y haz clic en el botón verde grande que dice </w:t>
+      </w:r>
+      <w:r>
+        <w:rPr>
+          <w:b/>
+          <w:bCs/>
+          <w:lang w:val="es-EC"/>
+        </w:rPr>
+        <w:t>"</w:t>
+      </w:r>
+      <w:proofErr w:type="spellStart"/>
+      <w:r>
+        <w:rPr>
+          <w:b/>
+          <w:bCs/>
+          <w:lang w:val="es-EC"/>
+        </w:rPr>
+        <w:t>Generate</w:t>
+      </w:r>
+      <w:proofErr w:type="spellEnd"/>
+      <w:r>
+        <w:rPr>
+          <w:b/>
+          <w:bCs/>
+          <w:lang w:val="es-EC"/>
+        </w:rPr>
+        <w:t xml:space="preserve"> token"</w:t>
+      </w:r>
+      <w:r>
+        <w:rPr>
+          <w:lang w:val="es-EC"/>
+        </w:rPr>
+        <w:t>.</w:t>
+      </w:r>
+    </w:p>
+    <w:p>
+      <w:pPr>
+        <w:numPr>
+          <w:ilvl w:val="0"/>
+          <w:numId w:val="1"/>
+        </w:numPr>
+        <w:rPr>
+          <w:lang w:val="es-EC"/>
+        </w:rPr>
+      </w:pPr>
+      <w:r>
+        <w:rPr>
+          <w:b/>
+          <w:bCs/>
+          <w:lang w:val="es-EC"/>
+        </w:rPr>
+        <w:t xml:space="preserve">Copia el código largo que empiece con </w:t>
+      </w:r>
+      <w:proofErr w:type="spellStart"/>
+      <w:r>
+        <w:rPr>
+          <w:b/>
+          <w:bCs/>
+          <w:lang w:val="es-EC"/>
+        </w:rPr>
+        <w:t>ghp</w:t>
+      </w:r>
+      <w:proofErr w:type="spellEnd"/>
+      <w:r>
+        <w:rPr>
+          <w:b/>
+          <w:bCs/>
+          <w:lang w:val="es-EC"/>
+        </w:rPr>
+        <w:t>_</w:t>
+      </w:r>
+      <w:r>
+        <w:rPr>
+          <w:lang w:val="es-EC"/>
+        </w:rPr>
+        <w:t xml:space="preserve"> que te va a salir en la siguiente pantalla.</w:t>
+      </w:r>
+    </w:p>
+    <w:p>
+      <w:pPr>
+        <w:rPr>
+          <w:b/>
+          <w:bCs/>
+          <w:lang w:val="es-EC"/>
+        </w:rPr>
+      </w:pPr>
+      <w:r>
+        <w:rPr>
+          <w:b/>
+          <w:bCs/>
+          <w:lang w:val="es-EC"/>
+        </w:rPr>
+        <w:t>Siguientes pasos en tu terminal:</w:t>
+      </w:r>
+    </w:p>
+    <w:p>
+      <w:pPr>
+        <w:rPr>
+          <w:lang w:val="es-EC"/>
+        </w:rPr>
+      </w:pPr>
+      <w:r>
+        <w:rPr>
+          <w:lang w:val="es-EC"/>
+        </w:rPr>
+        <w:t>Una vez que lo tengas copiado, ve a tu terminal de Git y escribe estos dos comandos en orden:</w:t>
+      </w:r>
+    </w:p>
+    <w:p>
+      <w:pPr>
+        <w:rPr>
+          <w:lang w:val="es-EC"/>
+        </w:rPr>
+      </w:pPr>
+      <w:proofErr w:type="spellStart"/>
+      <w:r>
+        <w:rPr>
+          <w:lang w:val="es-EC"/>
+        </w:rPr>
+        <w:t>bash</w:t>
+      </w:r>
+      <w:proofErr w:type="spellEnd"/>
+    </w:p>
+    <w:p>
+      <w:pPr>
+        <w:rPr>
+          <w:lang w:val="es-EC"/>
+        </w:rPr>
+      </w:pPr>
+      <w:proofErr w:type="spellStart"/>
+      <w:r>
+        <w:rPr>
+          <w:lang w:val="es-EC"/>
+        </w:rPr>
+        <w:t>git</w:t>
+      </w:r>
+      <w:proofErr w:type="spellEnd"/>
+      <w:r>
+        <w:rPr>
+          <w:lang w:val="es-EC"/>
+        </w:rPr>
+        <w:t xml:space="preserve"> remote set-</w:t>
+      </w:r>
+      <w:proofErr w:type="spellStart"/>
+      <w:r>
+        <w:rPr>
+          <w:lang w:val="es-EC"/>
+        </w:rPr>
+        <w:t>url</w:t>
+      </w:r>
+      <w:proofErr w:type="spellEnd"/>
+      <w:r>
+        <w:rPr>
+          <w:lang w:val="es-EC"/>
+        </w:rPr>
+        <w:t xml:space="preserve"> </w:t>
+      </w:r>
+      <w:proofErr w:type="spellStart"/>
+      <w:r>
+        <w:rPr>
+          <w:lang w:val="es-EC"/>
+        </w:rPr>
+        <w:t>origin</w:t>
+      </w:r>
+      <w:proofErr w:type="spellEnd"/>
+      <w:r>
+        <w:rPr>
+          <w:lang w:val="es-EC"/>
+        </w:rPr>
+        <w:t xml:space="preserve"> https://github.com/tpanchana6133-max/5-semestre.git</w:t>
+      </w:r>
+    </w:p>
+    <w:p>
+      <w:pPr>
+        <w:rPr>
+          <w:lang w:val="es-EC"/>
+        </w:rPr>
+      </w:pPr>
+      <w:r>
+        <w:rPr>
+          <w:lang w:val="es-EC"/>
+        </w:rPr>
+        <w:t>Usa el código con precaución.</w:t>
+      </w:r>
+    </w:p>
+    <w:p>
+      <w:pPr>
+        <w:rPr>
+          <w:lang w:val="es-EC"/>
+        </w:rPr>
+      </w:pPr>
+      <w:proofErr w:type="spellStart"/>
+      <w:r>
+        <w:rPr>
+          <w:lang w:val="es-EC"/>
+        </w:rPr>
+        <w:t>bash</w:t>
+      </w:r>
+      <w:proofErr w:type="spellEnd"/>
+    </w:p>
+    <w:p>
+      <w:pPr>
+        <w:rPr>
+          <w:lang w:val="es-EC"/>
+        </w:rPr>
+      </w:pPr>
+      <w:proofErr w:type="spellStart"/>
+      <w:r>
+        <w:rPr>
+          <w:lang w:val="es-EC"/>
+        </w:rPr>
+        <w:t>git</w:t>
+      </w:r>
+      <w:proofErr w:type="spellEnd"/>
+      <w:r>
+        <w:rPr>
+          <w:lang w:val="es-EC"/>
+        </w:rPr>
+        <w:t xml:space="preserve"> </w:t>
+      </w:r>
+      <w:proofErr w:type="spellStart"/>
+      <w:r>
+        <w:rPr>
+          <w:lang w:val="es-EC"/>
+        </w:rPr>
+        <w:t>push</w:t>
+      </w:r>
+      <w:proofErr w:type="spellEnd"/>
+      <w:r>
+        <w:rPr>
+          <w:lang w:val="es-EC"/>
+        </w:rPr>
+        <w:t xml:space="preserve"> -u </w:t>
+      </w:r>
+      <w:proofErr w:type="spellStart"/>
+      <w:r>
+        <w:rPr>
+          <w:lang w:val="es-EC"/>
+        </w:rPr>
+        <w:t>origin</w:t>
+      </w:r>
+      <w:proofErr w:type="spellEnd"/>
+      <w:r>
+        <w:rPr>
+          <w:lang w:val="es-EC"/>
+        </w:rPr>
+        <w:t xml:space="preserve"> </w:t>
+      </w:r>
+      <w:proofErr w:type="spellStart"/>
+      <w:r>
+        <w:rPr>
+          <w:lang w:val="es-EC"/>
+        </w:rPr>
+        <w:t>main</w:t>
+      </w:r>
+      <w:proofErr w:type="spellEnd"/>
+    </w:p>
+    <w:p>
+      <w:pPr>
+        <w:rPr>
+          <w:lang w:val="es-EC"/>
+        </w:rPr>
+      </w:pPr>
+      <w:r>
+        <w:rPr>
+          <w:lang w:val="es-EC"/>
+        </w:rPr>
+        <w:t>Usa el código con precaución.</w:t>
+      </w:r>
+    </w:p>
+    <w:p>
+      <w:pPr>
+        <w:rPr>
+          <w:lang w:val="es-EC"/>
+        </w:rPr>
+      </w:pPr>
+      <w:r>
+        <w:rPr>
+          <w:lang w:val="es-EC"/>
+        </w:rPr>
+        <w:t xml:space="preserve">Cuando te salga la ventana emergente, ve a la pestaña </w:t>
+      </w:r>
+      <w:r>
+        <w:rPr>
+          <w:b/>
+          <w:bCs/>
+          <w:lang w:val="es-EC"/>
+        </w:rPr>
+        <w:t>Token</w:t>
+      </w:r>
+      <w:r>
+        <w:rPr>
+          <w:lang w:val="es-EC"/>
+        </w:rPr>
+        <w:t xml:space="preserve">, pega tu nuevo código </w:t>
+      </w:r>
+      <w:proofErr w:type="spellStart"/>
+      <w:r>
+        <w:rPr>
+          <w:lang w:val="es-EC"/>
+        </w:rPr>
+        <w:t>ghp</w:t>
+      </w:r>
+      <w:proofErr w:type="spellEnd"/>
+      <w:r>
+        <w:rPr>
+          <w:lang w:val="es-EC"/>
+        </w:rPr>
+        <w:t xml:space="preserve">_ y haz clic en </w:t>
+      </w:r>
+      <w:proofErr w:type="spellStart"/>
+      <w:r>
+        <w:rPr>
+          <w:b/>
+          <w:bCs/>
+          <w:lang w:val="es-EC"/>
+        </w:rPr>
+        <w:t>Sign</w:t>
+      </w:r>
+      <w:proofErr w:type="spellEnd"/>
+      <w:r>
+        <w:rPr>
+          <w:b/>
+          <w:bCs/>
+          <w:lang w:val="es-EC"/>
+        </w:rPr>
+        <w:t xml:space="preserve"> in</w:t>
+      </w:r>
+      <w:r>
+        <w:rPr>
+          <w:lang w:val="es-EC"/>
+        </w:rPr>
+        <w:t>.</w:t>
+      </w:r>
+    </w:p>
+    <w:p>
+      <w:pPr>
+        <w:rPr>
+          <w:lang w:val="es-EC"/>
+        </w:rPr>
+      </w:pPr>
+      <w:r>
+        <w:rPr>
+          <w:lang w:val="es-EC"/>
+        </w:rPr>
+        <w:t xml:space="preserve">¿Pudiste </w:t>
+      </w:r>
+      <w:r>
+        <w:rPr>
+          <w:b/>
+          <w:bCs/>
+          <w:lang w:val="es-EC"/>
+        </w:rPr>
+        <w:t xml:space="preserve">generar y copiar el token </w:t>
+      </w:r>
+      <w:proofErr w:type="spellStart"/>
+      <w:r>
+        <w:rPr>
+          <w:b/>
+          <w:bCs/>
+          <w:lang w:val="es-EC"/>
+        </w:rPr>
+        <w:t>ghp</w:t>
+      </w:r>
+      <w:proofErr w:type="spellEnd"/>
+      <w:r>
+        <w:rPr>
+          <w:b/>
+          <w:bCs/>
+          <w:lang w:val="es-EC"/>
+        </w:rPr>
+        <w:t>_</w:t>
+      </w:r>
+      <w:r>
+        <w:rPr>
+          <w:lang w:val="es-EC"/>
+        </w:rPr>
+        <w:t xml:space="preserve">? Cuéntame si al pegarlo en la ventanita la terminal por fin avanzó y te mostró los </w:t>
+      </w:r>
+      <w:r>
+        <w:rPr>
+          <w:b/>
+          <w:bCs/>
+          <w:lang w:val="es-EC"/>
+        </w:rPr>
+        <w:t>porcentajes de carga (100%)</w:t>
+      </w:r>
+      <w:r>
+        <w:rPr>
+          <w:lang w:val="es-EC"/>
+        </w:rPr>
+        <w:t>.</w:t>
+      </w:r>
+    </w:p>
+    <w:p>
+      <w:pPr>
+        <w:rPr>
+          <w:lang w:val="es-EC"/>
+        </w:rPr>
+      </w:pPr>
     </w:p>
     <w:sectPr>
       <w:pgSz w:w="11906" w:h="16838"/>
@@ -38,6 +622,127 @@
     </w:sectPr>
   </w:body>
 </w:document>
+</file>
+
+<file path=word/numbering.xml><?xml version="1.0" encoding="utf-8"?>
+<w:numbering xmlns:wpc="http://schemas.microsoft.com/office/word/2010/wordprocessingCanvas" xmlns:cx="http://schemas.microsoft.com/office/drawing/2014/chartex" xmlns:cx1="http://schemas.microsoft.com/office/drawing/2015/9/8/chartex" xmlns:cx2="http://schemas.microsoft.com/office/drawing/2015/10/21/chartex" xmlns:cx3="http://schemas.microsoft.com/office/drawing/2016/5/9/chartex" xmlns:cx4="http://schemas.microsoft.com/office/drawing/2016/5/10/chartex" xmlns:cx5="http://schemas.microsoft.com/office/drawing/2016/5/11/chartex" xmlns:cx6="http://schemas.microsoft.com/office/drawing/2016/5/12/chartex" xmlns:cx7="http://schemas.microsoft.com/office/drawing/2016/5/13/chartex" xmlns:cx8="http://schemas.microsoft.com/office/drawing/2016/5/14/chartex" xmlns:mc="http://schemas.openxmlformats.org/markup-compatibility/2006" xmlns:aink="http://schemas.microsoft.com/office/drawing/2016/ink" xmlns:am3d="http://schemas.microsoft.com/office/drawing/2017/model3d" xmlns:o="urn:schemas-microsoft-com:office:office" xmlns:oel="http://schemas.microsoft.com/office/2019/extlst" xmlns:r="http://schemas.openxmlformats.org/officeDocument/2006/relationships" xmlns:m="http://schemas.openxmlformats.org/officeDocument/2006/math" xmlns:v="urn:schemas-microsoft-com:vml" xmlns:wp14="http://schemas.microsoft.com/office/word/2010/wordprocessingDrawing" xmlns:wp="http://schemas.openxmlformats.org/drawingml/2006/wordprocessingDrawing" xmlns:w10="urn:schemas-microsoft-com:office:word" xmlns:w="http://schemas.openxmlformats.org/wordprocessingml/2006/main" xmlns:w14="http://schemas.microsoft.com/office/word/2010/wordml" xmlns:w15="http://schemas.microsoft.com/office/word/2012/wordml" xmlns:w16cex="http://schemas.microsoft.com/office/word/2018/wordml/cex" xmlns:w16cid="http://schemas.microsoft.com/office/word/2016/wordml/cid" xmlns:w16="http://schemas.microsoft.com/office/word/2018/wordml" xmlns:w16du="http://schemas.microsoft.com/office/word/2023/wordml/word16du" xmlns:w16sdtdh="http://schemas.microsoft.com/office/word/2020/wordml/sdtdatahash" xmlns:w16sdtfl="http://schemas.microsoft.com/office/word/2024/wordml/sdtformatlock" xmlns:w16se="http://schemas.microsoft.com/office/word/2015/wordml/symex" xmlns:wpg="http://schemas.microsoft.com/office/word/2010/wordprocessingGroup" xmlns:wpi="http://schemas.microsoft.com/office/word/2010/wordprocessingInk" xmlns:wne="http://schemas.microsoft.com/office/word/2006/wordml" xmlns:wps="http://schemas.microsoft.com/office/word/2010/wordprocessingShape" mc:Ignorable="w14 w15 w16se w16cid w16 w16cex w16sdtdh w16sdtfl w16du wp14">
+  <w:abstractNum w:abstractNumId="0" w15:restartNumberingAfterBreak="0">
+    <w:nsid w:val="61746011"/>
+    <w:multiLevelType w:val="multilevel"/>
+    <w:tmpl w:val="79506818"/>
+    <w:lvl w:ilvl="0">
+      <w:start w:val="1"/>
+      <w:numFmt w:val="decimal"/>
+      <w:lvlText w:val="%1."/>
+      <w:lvlJc w:val="left"/>
+      <w:pPr>
+        <w:tabs>
+          <w:tab w:val="num" w:pos="720"/>
+        </w:tabs>
+        <w:ind w:left="720" w:hanging="360"/>
+      </w:pPr>
+    </w:lvl>
+    <w:lvl w:ilvl="1" w:tentative="1">
+      <w:start w:val="1"/>
+      <w:numFmt w:val="decimal"/>
+      <w:lvlText w:val="%2."/>
+      <w:lvlJc w:val="left"/>
+      <w:pPr>
+        <w:tabs>
+          <w:tab w:val="num" w:pos="1440"/>
+        </w:tabs>
+        <w:ind w:left="1440" w:hanging="360"/>
+      </w:pPr>
+    </w:lvl>
+    <w:lvl w:ilvl="2" w:tentative="1">
+      <w:start w:val="1"/>
+      <w:numFmt w:val="decimal"/>
+      <w:lvlText w:val="%3."/>
+      <w:lvlJc w:val="left"/>
+      <w:pPr>
+        <w:tabs>
+          <w:tab w:val="num" w:pos="2160"/>
+        </w:tabs>
+        <w:ind w:left="2160" w:hanging="360"/>
+      </w:pPr>
+    </w:lvl>
+    <w:lvl w:ilvl="3" w:tentative="1">
+      <w:start w:val="1"/>
+      <w:numFmt w:val="decimal"/>
+      <w:lvlText w:val="%4."/>
+      <w:lvlJc w:val="left"/>
+      <w:pPr>
+        <w:tabs>
+          <w:tab w:val="num" w:pos="2880"/>
+        </w:tabs>
+        <w:ind w:left="2880" w:hanging="360"/>
+      </w:pPr>
+    </w:lvl>
+    <w:lvl w:ilvl="4" w:tentative="1">
+      <w:start w:val="1"/>
+      <w:numFmt w:val="decimal"/>
+      <w:lvlText w:val="%5."/>
+      <w:lvlJc w:val="left"/>
+      <w:pPr>
+        <w:tabs>
+          <w:tab w:val="num" w:pos="3600"/>
+        </w:tabs>
+        <w:ind w:left="3600" w:hanging="360"/>
+      </w:pPr>
+    </w:lvl>
+    <w:lvl w:ilvl="5" w:tentative="1">
+      <w:start w:val="1"/>
+      <w:numFmt w:val="decimal"/>
+      <w:lvlText w:val="%6."/>
+      <w:lvlJc w:val="left"/>
+      <w:pPr>
+        <w:tabs>
+          <w:tab w:val="num" w:pos="4320"/>
+        </w:tabs>
+        <w:ind w:left="4320" w:hanging="360"/>
+      </w:pPr>
+    </w:lvl>
+    <w:lvl w:ilvl="6" w:tentative="1">
+      <w:start w:val="1"/>
+      <w:numFmt w:val="decimal"/>
+      <w:lvlText w:val="%7."/>
+      <w:lvlJc w:val="left"/>
+      <w:pPr>
+        <w:tabs>
+          <w:tab w:val="num" w:pos="5040"/>
+        </w:tabs>
+        <w:ind w:left="5040" w:hanging="360"/>
+      </w:pPr>
+    </w:lvl>
+    <w:lvl w:ilvl="7" w:tentative="1">
+      <w:start w:val="1"/>
+      <w:numFmt w:val="decimal"/>
+      <w:lvlText w:val="%8."/>
+      <w:lvlJc w:val="left"/>
+      <w:pPr>
+        <w:tabs>
+          <w:tab w:val="num" w:pos="5760"/>
+        </w:tabs>
+        <w:ind w:left="5760" w:hanging="360"/>
+      </w:pPr>
+    </w:lvl>
+    <w:lvl w:ilvl="8" w:tentative="1">
+      <w:start w:val="1"/>
+      <w:numFmt w:val="decimal"/>
+      <w:lvlText w:val="%9."/>
+      <w:lvlJc w:val="left"/>
+      <w:pPr>
+        <w:tabs>
+          <w:tab w:val="num" w:pos="6480"/>
+        </w:tabs>
+        <w:ind w:left="6480" w:hanging="360"/>
+      </w:pPr>
+    </w:lvl>
+  </w:abstractNum>
+  <w:num w:numId="1" w16cid:durableId="1915552668">
+    <w:abstractNumId w:val="0"/>
+  </w:num>
+</w:numbering>
 </file>
 
 <file path=word/styles.xml><?xml version="1.0" encoding="utf-8"?>
@@ -646,7 +1351,6 @@
   <w:style w:type="character" w:default="1" w:styleId="Fuentedeprrafopredeter">
     <w:name w:val="Default Paragraph Font"/>
     <w:uiPriority w:val="1"/>
-    <w:semiHidden/>
     <w:unhideWhenUsed/>
   </w:style>
   <w:style w:type="table" w:default="1" w:styleId="Tablanormal">

</xml_diff>